<commit_message>
Include acid dosing pump freight in the November budget
Add the £170 freight to the exclude-VAT pump amount and update the Summary, explanation, and application email.

Co-authored-by: peterli0913 <peterli0913@users.noreply.github.com>
</commit_message>
<xml_diff>
--- a/申请邮件/2026 November PP Opex Service Monthly Budget Application.docx
+++ b/申请邮件/2026 November PP Opex Service Monthly Budget Application.docx
@@ -48,7 +48,7 @@
     </w:p>
     <w:p>
       <w:r>
-        <w:t xml:space="preserve">68,665.29</w:t>
+        <w:t xml:space="preserve">68,835.29</w:t>
       </w:r>
     </w:p>
     <w:p>
@@ -88,7 +88,7 @@
     </w:p>
     <w:p>
       <w:r>
-        <w:t xml:space="preserve">122,445.29</w:t>
+        <w:t xml:space="preserve">122,615.29</w:t>
       </w:r>
     </w:p>
     <w:p>
@@ -115,7 +115,7 @@
     </w:p>
     <w:p>
       <w:r>
-        <w:t xml:space="preserve">68,665.29</w:t>
+        <w:t xml:space="preserve">68,835.29</w:t>
       </w:r>
     </w:p>
     <w:p>
@@ -130,12 +130,12 @@
     </w:p>
     <w:p>
       <w:r>
-        <w:t xml:space="preserve">16,153.80</w:t>
-      </w:r>
-    </w:p>
-    <w:p>
-      <w:r>
-        <w:t xml:space="preserve">CD02 heavily corroded. Quantity 2 at unit price 8,076.90. Quote received from Liquid Measuring Instruments.</w:t>
+        <w:t xml:space="preserve">16,323.80</w:t>
+      </w:r>
+    </w:p>
+    <w:p>
+      <w:r>
+        <w:t xml:space="preserve">CD02 heavily corroded. Quantity 2 at unit price 8,076.90 plus freight 170.00. Quote received from Liquid Measuring Instruments.</w:t>
       </w:r>
     </w:p>
     <w:p>

</xml_diff>